<commit_message>
docs: drop GOOGLE_TTS_FALLBACK_LANGUAGE setting — hardcode hi-IN fallback in code, no language knob in admin
Co-Authored-By: Claude Opus 4.8 (1M context) <noreply@anthropic.com>
</commit_message>
<xml_diff>
--- a/GOOGLE_TTS_PRD.docx
+++ b/GOOGLE_TTS_PRD.docx
@@ -555,48 +555,6 @@
           </w:p>
         </w:tc>
       </w:tr>
-      <w:tr>
-        <w:tc>
-          <w:tcPr>
-            <w:tcW w:type="dxa" w:w="2160"/>
-          </w:tcPr>
-          <w:p>
-            <w:r>
-              <w:t>GOOGLE_TTS_FALLBACK_LANGUAGE</w:t>
-            </w:r>
-          </w:p>
-        </w:tc>
-        <w:tc>
-          <w:tcPr>
-            <w:tcW w:type="dxa" w:w="2160"/>
-          </w:tcPr>
-          <w:p>
-            <w:r>
-              <w:t>dropdown</w:t>
-            </w:r>
-          </w:p>
-        </w:tc>
-        <w:tc>
-          <w:tcPr>
-            <w:tcW w:type="dxa" w:w="2160"/>
-          </w:tcPr>
-          <w:p>
-            <w:r>
-              <w:t>hi-IN</w:t>
-            </w:r>
-          </w:p>
-        </w:tc>
-        <w:tc>
-          <w:tcPr>
-            <w:tcW w:type="dxa" w:w="2160"/>
-          </w:tcPr>
-          <w:p>
-            <w:r>
-              <w:t>Used ONLY if a session has no language set.</w:t>
-            </w:r>
-          </w:p>
-        </w:tc>
-      </w:tr>
     </w:tbl>
     <w:p>
       <w:r>
@@ -604,6 +562,14 @@
           <w:b/>
         </w:rPr>
         <w:t>REMOVED: GOOGLE_TTS_LANGUAGE_CODE, GOOGLE_TTS_VOICE (full id), GOOGLE_TTS_PITCH.</w:t>
+      </w:r>
+    </w:p>
+    <w:p>
+      <w:r>
+        <w:rPr>
+          <w:b/>
+        </w:rPr>
+        <w:t>No language-related admin setting exists at all. If a session somehow has no language, the code falls back to "hi-IN" HARDCODED in the pipeline (see Sec 5) — deliberately NOT an admin setting, so nobody can ever again "configure" TTS language globally (that is the exact mistake this spec removes).</w:t>
       </w:r>
     </w:p>
     <w:p>
@@ -694,7 +660,7 @@
         <w:pStyle w:val="ListNumber"/>
       </w:pPr>
       <w:r>
-        <w:t>ADD GOOGLE_TTS_VOICE_NAME (dropdown, Sec 4) and GOOGLE_TTS_FALLBACK_LANGUAGE.</w:t>
+        <w:t>ADD GOOGLE_TTS_VOICE_NAME (dropdown, Sec 4). No other new settings.</w:t>
       </w:r>
     </w:p>
     <w:p>
@@ -721,7 +687,7 @@
         </w:rPr>
         <w:t>lang_key = session.language                       # "tel", "hin", ...</w:t>
         <w:br/>
-        <w:t>code     = GOOGLE_LANG_CODE.get(lang_key) or settings.GOOGLE_TTS_FALLBACK_LANGUAGE</w:t>
+        <w:t>code     = GOOGLE_LANG_CODE.get(lang_key, "hi-IN")  # hardcoded safety net, NOT a setting</w:t>
         <w:br/>
         <w:t>persona  = settings.GOOGLE_TTS_VOICE_NAME         # "Sulafat"</w:t>
         <w:br/>
@@ -826,7 +792,7 @@
         <w:pStyle w:val="ListNumber"/>
       </w:pPr>
       <w:r>
-        <w:t>Grep the codebase: GOOGLE_TTS_LANGUAGE_CODE and GOOGLE_TTS_PITCH return zero matches.</w:t>
+        <w:t>Grep the codebase: GOOGLE_TTS_LANGUAGE_CODE, GOOGLE_TTS_PITCH and GOOGLE_TTS_FALLBACK_LANGUAGE return zero matches.</w:t>
       </w:r>
     </w:p>
     <w:p>

</xml_diff>